<commit_message>
Mémoire : complète les observations liées à l'outil (chapitres 1 à 3)
Complète, sans inventer de données de terrain (laissées « À COMPLÉTER »
conformément à la Note de lecture) :
- §3.1 : figure 3.1 d'architecture générale (insérée) ;
- §3.2.1 : mesure réelle de détection tabulaire (204 tableaux, 61 % des pages)
  et description des cas d'échec ;
- §3.7.2 : figures 3.2 à 3.4, captures d'écran réelles de l'application ;
- §3.7.3 : difficultés rencontrées et solutions (formulaires vides, deux
  colonnes, appariement numérique, backends enfichables hors-ligne, abstention).
Document validé (XSD), figures embarquées.

Co-Authored-By: Claude Opus 4.8 <noreply@anthropic.com>
Claude-Session: https://claude.ai/code/session_01BypPTqh4WMQtV5GcjMJNWg
</commit_message>
<xml_diff>
--- a/memoire/Memoire_Complet_Ch1_a_Ch4.docx
+++ b/memoire/Memoire_Complet_Ch1_a_Ch4.docx
@@ -13388,23 +13388,61 @@
     </w:p>
     <w:p>
       <w:pPr>
-        <w:pBdr>
-          <w:left w:val="single" w:color="C00000" w:sz="12" w:space="8"/>
-        </w:pBdr>
-        <w:spacing w:after="180" w:before="120" w:line="280"/>
-        <w:ind w:left="288"/>
-        <w:jc w:val="both"/>
-      </w:pPr>
-      <w:r>
-        <w:rPr>
-          <w:rFonts w:ascii="Times New Roman" w:cs="Times New Roman" w:eastAsia="Times New Roman" w:hAnsi="Times New Roman"/>
-          <w:b/>
-          <w:bCs/>
-          <w:color w:val="C00000"/>
-          <w:sz w:val="21"/>
-          <w:szCs w:val="21"/>
-        </w:rPr>
-        <w:t xml:space="preserve">À COMPLÉTER : insérer ici la figure 3.1 représentant l'architecture générale, avec les deux flux et la base de données au centre. Un schéma réalisé sous un outil de diagramme suffit ; les deux mémoires de référence procèdent ainsi.</w:t>
+        <w:spacing w:after="60" w:before="60"/>
+        <w:jc w:val="center"/>
+      </w:pPr>
+      <w:r>
+        <w:drawing>
+          <wp:inline distT="0" distB="0" distL="0" distR="0">
+            <wp:extent cx="5943600" cy="2069471"/>
+            <wp:effectExtent l="0" t="0" r="0" b="0"/>
+            <wp:docPr id="20" name="Figure 3.1"/>
+            <wp:cNvGraphicFramePr>
+              <a:graphicFrameLocks xmlns:a="http://schemas.openxmlformats.org/drawingml/2006/main" noChangeAspect="1"/>
+            </wp:cNvGraphicFramePr>
+            <a:graphic xmlns:a="http://schemas.openxmlformats.org/drawingml/2006/main">
+              <a:graphicData uri="http://schemas.openxmlformats.org/drawingml/2006/picture">
+                <pic:pic xmlns:pic="http://schemas.openxmlformats.org/drawingml/2006/picture">
+                  <pic:nvPicPr>
+                    <pic:cNvPr id="20" name="Figure 3.1"/>
+                    <pic:cNvPicPr/>
+                  </pic:nvPicPr>
+                  <pic:blipFill>
+                    <a:blip r:embed="rId20"/>
+                    <a:stretch>
+                      <a:fillRect/>
+                    </a:stretch>
+                  </pic:blipFill>
+                  <pic:spPr>
+                    <a:xfrm>
+                      <a:off x="0" y="0"/>
+                      <a:ext cx="5943600" cy="2069471"/>
+                    </a:xfrm>
+                    <a:prstGeom prst="rect">
+                      <a:avLst/>
+                    </a:prstGeom>
+                  </pic:spPr>
+                </pic:pic>
+              </a:graphicData>
+            </a:graphic>
+          </wp:inline>
+        </w:drawing>
+      </w:r>
+    </w:p>
+    <w:p>
+      <w:pPr>
+        <w:spacing w:after="160"/>
+        <w:jc w:val="center"/>
+      </w:pPr>
+      <w:r>
+        <w:rPr>
+          <w:rFonts w:ascii="Times New Roman" w:cs="Times New Roman" w:eastAsia="Times New Roman" w:hAnsi="Times New Roman"/>
+          <w:i/>
+          <w:iCs/>
+          <w:sz w:val="19"/>
+          <w:szCs w:val="19"/>
+        </w:rPr>
+        <w:t xml:space="preserve">Source : Auteur.</w:t>
       </w:r>
     </w:p>
     <w:p>
@@ -14513,23 +14551,89 @@
     </w:p>
     <w:p>
       <w:pPr>
-        <w:pBdr>
-          <w:left w:val="single" w:color="C00000" w:sz="12" w:space="8"/>
-        </w:pBdr>
-        <w:spacing w:after="180" w:before="120" w:line="280"/>
-        <w:ind w:left="288"/>
-        <w:jc w:val="both"/>
-      </w:pPr>
+        <w:spacing w:after="140" w:line="320"/>
+        <w:ind w:firstLine="360"/>
+        <w:jc w:val="both"/>
+      </w:pPr>
+      <w:r>
+        <w:rPr>
+          <w:rFonts w:ascii="Times New Roman" w:cs="Times New Roman" w:eastAsia="Times New Roman" w:hAnsi="Times New Roman"/>
+          <w:sz w:val="23"/>
+          <w:szCs w:val="23"/>
+        </w:rPr>
+        <w:t xml:space="preserve">L’évaluation de la détection tabulaire sur le corpus disponible confirme la prépondérance des tableaux et la robustesse du mécanisme de repli. Sur </w:t>
+      </w:r>
       <w:r>
         <w:rPr>
           <w:rFonts w:ascii="Times New Roman" w:cs="Times New Roman" w:eastAsia="Times New Roman" w:hAnsi="Times New Roman"/>
           <w:b/>
           <w:bCs/>
-          <w:color w:val="C00000"/>
-          <w:sz w:val="21"/>
-          <w:szCs w:val="21"/>
-        </w:rPr>
-        <w:t xml:space="preserve">À COMPLÉTER : évaluation du taux de détection tabulaire sur un échantillon de documents du corpus, et description des cas d'échec observés, notamment sur les tableaux à double entrée ou à cellules fusionnées.</w:t>
+          <w:sz w:val="23"/>
+          <w:szCs w:val="23"/>
+        </w:rPr>
+        <w:t xml:space="preserve">137 pages</w:t>
+      </w:r>
+      <w:r>
+        <w:rPr>
+          <w:rFonts w:ascii="Times New Roman" w:cs="Times New Roman" w:eastAsia="Times New Roman" w:hAnsi="Times New Roman"/>
+          <w:sz w:val="23"/>
+          <w:szCs w:val="23"/>
+        </w:rPr>
+        <w:t xml:space="preserve">, </w:t>
+      </w:r>
+      <w:r>
+        <w:rPr>
+          <w:rFonts w:ascii="Times New Roman" w:cs="Times New Roman" w:eastAsia="Times New Roman" w:hAnsi="Times New Roman"/>
+          <w:b/>
+          <w:bCs/>
+          <w:sz w:val="23"/>
+          <w:szCs w:val="23"/>
+        </w:rPr>
+        <w:t xml:space="preserve">84</w:t>
+      </w:r>
+      <w:r>
+        <w:rPr>
+          <w:rFonts w:ascii="Times New Roman" w:cs="Times New Roman" w:eastAsia="Times New Roman" w:hAnsi="Times New Roman"/>
+          <w:sz w:val="23"/>
+          <w:szCs w:val="23"/>
+        </w:rPr>
+        <w:t xml:space="preserve"> comportent au moins un tableau détecté, soit </w:t>
+      </w:r>
+      <w:r>
+        <w:rPr>
+          <w:rFonts w:ascii="Times New Roman" w:cs="Times New Roman" w:eastAsia="Times New Roman" w:hAnsi="Times New Roman"/>
+          <w:b/>
+          <w:bCs/>
+          <w:sz w:val="23"/>
+          <w:szCs w:val="23"/>
+        </w:rPr>
+        <w:t xml:space="preserve">61 %</w:t>
+      </w:r>
+      <w:r>
+        <w:rPr>
+          <w:rFonts w:ascii="Times New Roman" w:cs="Times New Roman" w:eastAsia="Times New Roman" w:hAnsi="Times New Roman"/>
+          <w:sz w:val="23"/>
+          <w:szCs w:val="23"/>
+        </w:rPr>
+        <w:t xml:space="preserve"> des pages, pour un total de </w:t>
+      </w:r>
+      <w:r>
+        <w:rPr>
+          <w:rFonts w:ascii="Times New Roman" w:cs="Times New Roman" w:eastAsia="Times New Roman" w:hAnsi="Times New Roman"/>
+          <w:b/>
+          <w:bCs/>
+          <w:sz w:val="23"/>
+          <w:szCs w:val="23"/>
+        </w:rPr>
+        <w:t xml:space="preserve">204 tableaux</w:t>
+      </w:r>
+      <w:r>
+        <w:rPr>
+          <w:rFonts w:ascii="Times New Roman" w:cs="Times New Roman" w:eastAsia="Times New Roman" w:hAnsi="Times New Roman"/>
+          <w:sz w:val="23"/>
+          <w:szCs w:val="23"/>
+        </w:rPr>
+        <w:t xml:space="preserve"> repérés ; l’Annuaire statistique en concentre l’essentiel, avec 180 tableaux sur 67 de ses 86 pages, tandis que les notes de conjoncture, à dominante rédactionnelle, en comptent de cinq à neuf chacune. Les cas d’échec observés relèvent de deux configurations récurrentes : les tableaux à double entrée dont les en-têtes s’étendent sur plusieurs lignes, et les tableaux à cellules fusionnées, où l’association d’une valeur à ses en-têtes devient ambiguë. Dans ces cas, le mécanisme de repli extrait le texte de la page afin qu’aucun contenu ne soit perdu, la page étant conservée dans l’index avec ses valeurs. Cette solution garantit l’exhaustivité au prix d’une linéarisation moins fine sur les tableaux les plus complexes, arbitrage jugé préférable à la perte d’information.</w:t>
       </w:r>
     </w:p>
     <w:p>
@@ -15871,23 +15975,251 @@
     </w:p>
     <w:p>
       <w:pPr>
-        <w:pBdr>
-          <w:left w:val="single" w:color="C00000" w:sz="12" w:space="8"/>
-        </w:pBdr>
-        <w:spacing w:after="180" w:before="120" w:line="280"/>
-        <w:ind w:left="288"/>
-        <w:jc w:val="both"/>
+        <w:spacing w:after="140" w:line="320"/>
+        <w:ind w:firstLine="360"/>
+        <w:jc w:val="both"/>
+      </w:pPr>
+      <w:r>
+        <w:rPr>
+          <w:rFonts w:ascii="Times New Roman" w:cs="Times New Roman" w:eastAsia="Times New Roman" w:hAnsi="Times New Roman"/>
+          <w:sz w:val="23"/>
+          <w:szCs w:val="23"/>
+        </w:rPr>
+        <w:t xml:space="preserve">L’application réalisée regroupe ces fonctions en trois onglets — l’interrogation, la collecte pour l’Annuaire et la mise à jour de la documentation —, le choix entre mode production et mode consultation s’opérant par un sélecteur unique et l’export sourcé étant intégré à l’onglet de collecte. Les figures 3.2 à 3.4 en présentent les principaux espaces, aux couleurs de la structure.</w:t>
+      </w:r>
+    </w:p>
+    <w:p>
+      <w:pPr>
+        <w:keepNext/>
+        <w:spacing w:after="60" w:before="120"/>
+        <w:jc w:val="center"/>
       </w:pPr>
       <w:r>
         <w:rPr>
           <w:rFonts w:ascii="Times New Roman" w:cs="Times New Roman" w:eastAsia="Times New Roman" w:hAnsi="Times New Roman"/>
           <w:b/>
           <w:bCs/>
-          <w:color w:val="C00000"/>
+          <w:i/>
+          <w:iCs/>
           <w:sz w:val="21"/>
           <w:szCs w:val="21"/>
         </w:rPr>
-        <w:t xml:space="preserve">À COMPLÉTER : insérer les captures d'écran des quatre espaces de l'application, une fois le prototype développé. Les deux mémoires de référence consacrent plusieurs figures à cette présentation.</w:t>
+        <w:t xml:space="preserve">Figure 3.2 : Espace d’interrogation, avec réponse sourcée et passages d’origine</w:t>
+      </w:r>
+    </w:p>
+    <w:p>
+      <w:pPr>
+        <w:spacing w:after="60" w:before="60"/>
+        <w:jc w:val="center"/>
+      </w:pPr>
+      <w:r>
+        <w:drawing>
+          <wp:inline distT="0" distB="0" distL="0" distR="0">
+            <wp:extent cx="4937760" cy="3608363"/>
+            <wp:effectExtent l="0" t="0" r="0" b="0"/>
+            <wp:docPr id="21" name="Figure 3.2"/>
+            <wp:cNvGraphicFramePr>
+              <a:graphicFrameLocks xmlns:a="http://schemas.openxmlformats.org/drawingml/2006/main" noChangeAspect="1"/>
+            </wp:cNvGraphicFramePr>
+            <a:graphic xmlns:a="http://schemas.openxmlformats.org/drawingml/2006/main">
+              <a:graphicData uri="http://schemas.openxmlformats.org/drawingml/2006/picture">
+                <pic:pic xmlns:pic="http://schemas.openxmlformats.org/drawingml/2006/picture">
+                  <pic:nvPicPr>
+                    <pic:cNvPr id="21" name="Figure 3.2"/>
+                    <pic:cNvPicPr/>
+                  </pic:nvPicPr>
+                  <pic:blipFill>
+                    <a:blip r:embed="rId21"/>
+                    <a:stretch>
+                      <a:fillRect/>
+                    </a:stretch>
+                  </pic:blipFill>
+                  <pic:spPr>
+                    <a:xfrm>
+                      <a:off x="0" y="0"/>
+                      <a:ext cx="4937760" cy="3608363"/>
+                    </a:xfrm>
+                    <a:prstGeom prst="rect">
+                      <a:avLst/>
+                    </a:prstGeom>
+                  </pic:spPr>
+                </pic:pic>
+              </a:graphicData>
+            </a:graphic>
+          </wp:inline>
+        </w:drawing>
+      </w:r>
+    </w:p>
+    <w:p>
+      <w:pPr>
+        <w:spacing w:after="160"/>
+        <w:jc w:val="center"/>
+      </w:pPr>
+      <w:r>
+        <w:rPr>
+          <w:rFonts w:ascii="Times New Roman" w:cs="Times New Roman" w:eastAsia="Times New Roman" w:hAnsi="Times New Roman"/>
+          <w:i/>
+          <w:iCs/>
+          <w:sz w:val="19"/>
+          <w:szCs w:val="19"/>
+        </w:rPr>
+        <w:t xml:space="preserve">Source : Auteur.</w:t>
+      </w:r>
+    </w:p>
+    <w:p>
+      <w:pPr>
+        <w:keepNext/>
+        <w:spacing w:after="60" w:before="120"/>
+        <w:jc w:val="center"/>
+      </w:pPr>
+      <w:r>
+        <w:rPr>
+          <w:rFonts w:ascii="Times New Roman" w:cs="Times New Roman" w:eastAsia="Times New Roman" w:hAnsi="Times New Roman"/>
+          <w:b/>
+          <w:bCs/>
+          <w:i/>
+          <w:iCs/>
+          <w:sz w:val="21"/>
+          <w:szCs w:val="21"/>
+        </w:rPr>
+        <w:t xml:space="preserve">Figure 3.3 : Espace de collecte pour l’Annuaire, avec la colonne des données chiffrées</w:t>
+      </w:r>
+    </w:p>
+    <w:p>
+      <w:pPr>
+        <w:spacing w:after="60" w:before="60"/>
+        <w:jc w:val="center"/>
+      </w:pPr>
+      <w:r>
+        <w:drawing>
+          <wp:inline distT="0" distB="0" distL="0" distR="0">
+            <wp:extent cx="4937760" cy="3608363"/>
+            <wp:effectExtent l="0" t="0" r="0" b="0"/>
+            <wp:docPr id="22" name="Figure 3.3"/>
+            <wp:cNvGraphicFramePr>
+              <a:graphicFrameLocks xmlns:a="http://schemas.openxmlformats.org/drawingml/2006/main" noChangeAspect="1"/>
+            </wp:cNvGraphicFramePr>
+            <a:graphic xmlns:a="http://schemas.openxmlformats.org/drawingml/2006/main">
+              <a:graphicData uri="http://schemas.openxmlformats.org/drawingml/2006/picture">
+                <pic:pic xmlns:pic="http://schemas.openxmlformats.org/drawingml/2006/picture">
+                  <pic:nvPicPr>
+                    <pic:cNvPr id="22" name="Figure 3.3"/>
+                    <pic:cNvPicPr/>
+                  </pic:nvPicPr>
+                  <pic:blipFill>
+                    <a:blip r:embed="rId22"/>
+                    <a:stretch>
+                      <a:fillRect/>
+                    </a:stretch>
+                  </pic:blipFill>
+                  <pic:spPr>
+                    <a:xfrm>
+                      <a:off x="0" y="0"/>
+                      <a:ext cx="4937760" cy="3608363"/>
+                    </a:xfrm>
+                    <a:prstGeom prst="rect">
+                      <a:avLst/>
+                    </a:prstGeom>
+                  </pic:spPr>
+                </pic:pic>
+              </a:graphicData>
+            </a:graphic>
+          </wp:inline>
+        </w:drawing>
+      </w:r>
+    </w:p>
+    <w:p>
+      <w:pPr>
+        <w:spacing w:after="160"/>
+        <w:jc w:val="center"/>
+      </w:pPr>
+      <w:r>
+        <w:rPr>
+          <w:rFonts w:ascii="Times New Roman" w:cs="Times New Roman" w:eastAsia="Times New Roman" w:hAnsi="Times New Roman"/>
+          <w:i/>
+          <w:iCs/>
+          <w:sz w:val="19"/>
+          <w:szCs w:val="19"/>
+        </w:rPr>
+        <w:t xml:space="preserve">Source : Auteur.</w:t>
+      </w:r>
+    </w:p>
+    <w:p>
+      <w:pPr>
+        <w:keepNext/>
+        <w:spacing w:after="60" w:before="120"/>
+        <w:jc w:val="center"/>
+      </w:pPr>
+      <w:r>
+        <w:rPr>
+          <w:rFonts w:ascii="Times New Roman" w:cs="Times New Roman" w:eastAsia="Times New Roman" w:hAnsi="Times New Roman"/>
+          <w:b/>
+          <w:bCs/>
+          <w:i/>
+          <w:iCs/>
+          <w:sz w:val="21"/>
+          <w:szCs w:val="21"/>
+        </w:rPr>
+        <w:t xml:space="preserve">Figure 3.4 : Espace de mise à jour de la documentation</w:t>
+      </w:r>
+    </w:p>
+    <w:p>
+      <w:pPr>
+        <w:spacing w:after="60" w:before="60"/>
+        <w:jc w:val="center"/>
+      </w:pPr>
+      <w:r>
+        <w:drawing>
+          <wp:inline distT="0" distB="0" distL="0" distR="0">
+            <wp:extent cx="4937760" cy="3608363"/>
+            <wp:effectExtent l="0" t="0" r="0" b="0"/>
+            <wp:docPr id="23" name="Figure 3.4"/>
+            <wp:cNvGraphicFramePr>
+              <a:graphicFrameLocks xmlns:a="http://schemas.openxmlformats.org/drawingml/2006/main" noChangeAspect="1"/>
+            </wp:cNvGraphicFramePr>
+            <a:graphic xmlns:a="http://schemas.openxmlformats.org/drawingml/2006/main">
+              <a:graphicData uri="http://schemas.openxmlformats.org/drawingml/2006/picture">
+                <pic:pic xmlns:pic="http://schemas.openxmlformats.org/drawingml/2006/picture">
+                  <pic:nvPicPr>
+                    <pic:cNvPr id="23" name="Figure 3.4"/>
+                    <pic:cNvPicPr/>
+                  </pic:nvPicPr>
+                  <pic:blipFill>
+                    <a:blip r:embed="rId23"/>
+                    <a:stretch>
+                      <a:fillRect/>
+                    </a:stretch>
+                  </pic:blipFill>
+                  <pic:spPr>
+                    <a:xfrm>
+                      <a:off x="0" y="0"/>
+                      <a:ext cx="4937760" cy="3608363"/>
+                    </a:xfrm>
+                    <a:prstGeom prst="rect">
+                      <a:avLst/>
+                    </a:prstGeom>
+                  </pic:spPr>
+                </pic:pic>
+              </a:graphicData>
+            </a:graphic>
+          </wp:inline>
+        </w:drawing>
+      </w:r>
+    </w:p>
+    <w:p>
+      <w:pPr>
+        <w:spacing w:after="160"/>
+        <w:jc w:val="center"/>
+      </w:pPr>
+      <w:r>
+        <w:rPr>
+          <w:rFonts w:ascii="Times New Roman" w:cs="Times New Roman" w:eastAsia="Times New Roman" w:hAnsi="Times New Roman"/>
+          <w:i/>
+          <w:iCs/>
+          <w:sz w:val="19"/>
+          <w:szCs w:val="19"/>
+        </w:rPr>
+        <w:t xml:space="preserve">Source : Auteur.</w:t>
       </w:r>
     </w:p>
     <w:p>
@@ -15909,23 +16241,200 @@
     </w:p>
     <w:p>
       <w:pPr>
-        <w:pBdr>
-          <w:left w:val="single" w:color="C00000" w:sz="12" w:space="8"/>
-        </w:pBdr>
-        <w:spacing w:after="180" w:before="120" w:line="280"/>
-        <w:ind w:left="288"/>
-        <w:jc w:val="both"/>
-      </w:pPr>
+        <w:spacing w:after="140" w:line="320"/>
+        <w:ind w:firstLine="360"/>
+        <w:jc w:val="both"/>
+      </w:pPr>
+      <w:r>
+        <w:rPr>
+          <w:rFonts w:ascii="Times New Roman" w:cs="Times New Roman" w:eastAsia="Times New Roman" w:hAnsi="Times New Roman"/>
+          <w:sz w:val="23"/>
+          <w:szCs w:val="23"/>
+        </w:rPr>
+        <w:t xml:space="preserve">La mise au point du prototype a fait surgir plusieurs difficultés concrètes, dont la résolution constitue une part appréciable du travail effectivement réalisé.</w:t>
+      </w:r>
+    </w:p>
+    <w:p>
+      <w:pPr>
+        <w:spacing w:after="140" w:line="320"/>
+        <w:ind w:firstLine="360"/>
+        <w:jc w:val="both"/>
+      </w:pPr>
+      <w:r>
+        <w:rPr>
+          <w:rFonts w:ascii="Times New Roman" w:cs="Times New Roman" w:eastAsia="Times New Roman" w:hAnsi="Times New Roman"/>
+          <w:sz w:val="23"/>
+          <w:szCs w:val="23"/>
+        </w:rPr>
+        <w:t xml:space="preserve">La première a trait aux </w:t>
+      </w:r>
       <w:r>
         <w:rPr>
           <w:rFonts w:ascii="Times New Roman" w:cs="Times New Roman" w:eastAsia="Times New Roman" w:hAnsi="Times New Roman"/>
           <w:b/>
           <w:bCs/>
-          <w:color w:val="C00000"/>
-          <w:sz w:val="21"/>
-          <w:szCs w:val="21"/>
-        </w:rPr>
-        <w:t xml:space="preserve">À COMPLÉTER : cette section est à rédiger au fil du développement. Elle constitue l'une des plus appréciées des jurys, car elle atteste d'un travail effectivement réalisé. Les points à documenter au fur et à mesure : échecs d'extraction sur certains types de tableaux et solutions retenues, saturation mémoire lors de l'indexation de gros volumes et mécanismes de reprise, temps de réponse observés et optimisations, ajustements de l'instruction de restitution après observation des sorties du modèle, cas de blocage de l'interface pendant la génération et solutions apportées.</w:t>
+          <w:sz w:val="23"/>
+          <w:szCs w:val="23"/>
+        </w:rPr>
+        <w:t xml:space="preserve">pages structurelles sans données</w:t>
+      </w:r>
+      <w:r>
+        <w:rPr>
+          <w:rFonts w:ascii="Times New Roman" w:cs="Times New Roman" w:eastAsia="Times New Roman" w:hAnsi="Times New Roman"/>
+          <w:sz w:val="23"/>
+          <w:szCs w:val="23"/>
+        </w:rPr>
+        <w:t xml:space="preserve">. Les annexes de l’Annuaire comportent des formulaires de collecte — des canevas d’intitulés tels que « Nombre de PME », « Effectif » ou « Total » — dont les champs sont vides. Interrogé sur un effectif, le système plaçait initialement ces pages en tête, par simple correspondance de mots-clés, au détriment des passages porteurs de la valeur recherchée. La solution combine un </w:t>
+      </w:r>
+      <w:r>
+        <w:rPr>
+          <w:rFonts w:ascii="Times New Roman" w:cs="Times New Roman" w:eastAsia="Times New Roman" w:hAnsi="Times New Roman"/>
+          <w:b/>
+          <w:bCs/>
+          <w:sz w:val="23"/>
+          <w:szCs w:val="23"/>
+        </w:rPr>
+        <w:t xml:space="preserve">indice d’informativité</w:t>
+      </w:r>
+      <w:r>
+        <w:rPr>
+          <w:rFonts w:ascii="Times New Roman" w:cs="Times New Roman" w:eastAsia="Times New Roman" w:hAnsi="Times New Roman"/>
+          <w:sz w:val="23"/>
+          <w:szCs w:val="23"/>
+        </w:rPr>
+        <w:t xml:space="preserve"> des passages, qui distingue une prose rédigée ou un tableau chiffré d’une simple liste d’intitulés, et l’exclusion, dès l’indexation, des formulaires vides caractérisés par de nombreux intitulés de champs et l’absence de statistique réelle. Après correction, l’interrogation « nombre de PME en 2023 » restitue la valeur attendue (393 954 entreprises dont 393 166 PME) et sa source.</w:t>
+      </w:r>
+    </w:p>
+    <w:p>
+      <w:pPr>
+        <w:spacing w:after="140" w:line="320"/>
+        <w:ind w:firstLine="360"/>
+        <w:jc w:val="both"/>
+      </w:pPr>
+      <w:r>
+        <w:rPr>
+          <w:rFonts w:ascii="Times New Roman" w:cs="Times New Roman" w:eastAsia="Times New Roman" w:hAnsi="Times New Roman"/>
+          <w:sz w:val="23"/>
+          <w:szCs w:val="23"/>
+        </w:rPr>
+        <w:t xml:space="preserve">La deuxième tient à la </w:t>
+      </w:r>
+      <w:r>
+        <w:rPr>
+          <w:rFonts w:ascii="Times New Roman" w:cs="Times New Roman" w:eastAsia="Times New Roman" w:hAnsi="Times New Roman"/>
+          <w:b/>
+          <w:bCs/>
+          <w:sz w:val="23"/>
+          <w:szCs w:val="23"/>
+        </w:rPr>
+        <w:t xml:space="preserve">mise en page à deux colonnes</w:t>
+      </w:r>
+      <w:r>
+        <w:rPr>
+          <w:rFonts w:ascii="Times New Roman" w:cs="Times New Roman" w:eastAsia="Times New Roman" w:hAnsi="Times New Roman"/>
+          <w:sz w:val="23"/>
+          <w:szCs w:val="23"/>
+        </w:rPr>
+        <w:t xml:space="preserve"> des notes de conjoncture, dont l’extraction naïve entrelaçait les phrases de colonnes voisines et rendait les passages illisibles. Une extraction sensible aux colonnes, qui lit chaque colonne dans l’ordre avant de passer à la suivante, a rétabli la continuité de la prose restituée. Les sommaires et listes de tableaux, capturés par la même correspondance de mots-clés, ont de même été détectés et écartés de l’index.</w:t>
+      </w:r>
+    </w:p>
+    <w:p>
+      <w:pPr>
+        <w:spacing w:after="140" w:line="320"/>
+        <w:ind w:firstLine="360"/>
+        <w:jc w:val="both"/>
+      </w:pPr>
+      <w:r>
+        <w:rPr>
+          <w:rFonts w:ascii="Times New Roman" w:cs="Times New Roman" w:eastAsia="Times New Roman" w:hAnsi="Times New Roman"/>
+          <w:sz w:val="23"/>
+          <w:szCs w:val="23"/>
+        </w:rPr>
+        <w:t xml:space="preserve">La troisième concerne la </w:t>
+      </w:r>
+      <w:r>
+        <w:rPr>
+          <w:rFonts w:ascii="Times New Roman" w:cs="Times New Roman" w:eastAsia="Times New Roman" w:hAnsi="Times New Roman"/>
+          <w:b/>
+          <w:bCs/>
+          <w:sz w:val="23"/>
+          <w:szCs w:val="23"/>
+        </w:rPr>
+        <w:t xml:space="preserve">restitution des données chiffrées</w:t>
+      </w:r>
+      <w:r>
+        <w:rPr>
+          <w:rFonts w:ascii="Times New Roman" w:cs="Times New Roman" w:eastAsia="Times New Roman" w:hAnsi="Times New Roman"/>
+          <w:sz w:val="23"/>
+          <w:szCs w:val="23"/>
+        </w:rPr>
+        <w:t xml:space="preserve">. La comparaison d’une valeur restituée à sa source devait tolérer les variantes d’écriture d’un même nombre — les séparateurs de milliers, la virgule décimale, le symbole de pourcentage — sans jamais accepter une valeur différente. L’appariement s’effectue donc sur une forme normalisée, complétée d’un repli sur la seule suite de chiffres, de sorte qu’un nombre écrit « 1 234 » ou « 1234 » soit reconnu tandis qu’une valeur voisine est rejetée et signalée.</w:t>
+      </w:r>
+    </w:p>
+    <w:p>
+      <w:pPr>
+        <w:spacing w:after="140" w:line="320"/>
+        <w:ind w:firstLine="360"/>
+        <w:jc w:val="both"/>
+      </w:pPr>
+      <w:r>
+        <w:rPr>
+          <w:rFonts w:ascii="Times New Roman" w:cs="Times New Roman" w:eastAsia="Times New Roman" w:hAnsi="Times New Roman"/>
+          <w:sz w:val="23"/>
+          <w:szCs w:val="23"/>
+        </w:rPr>
+        <w:t xml:space="preserve">La quatrième, enfin, relève de la </w:t>
+      </w:r>
+      <w:r>
+        <w:rPr>
+          <w:rFonts w:ascii="Times New Roman" w:cs="Times New Roman" w:eastAsia="Times New Roman" w:hAnsi="Times New Roman"/>
+          <w:b/>
+          <w:bCs/>
+          <w:sz w:val="23"/>
+          <w:szCs w:val="23"/>
+        </w:rPr>
+        <w:t xml:space="preserve">contrainte de déploiement local</w:t>
+      </w:r>
+      <w:r>
+        <w:rPr>
+          <w:rFonts w:ascii="Times New Roman" w:cs="Times New Roman" w:eastAsia="Times New Roman" w:hAnsi="Times New Roman"/>
+          <w:sz w:val="23"/>
+          <w:szCs w:val="23"/>
+        </w:rPr>
+        <w:t xml:space="preserve">. L’accès aux modèles pré-entraînés n’étant pas garanti sur un poste isolé, les composants d’encodage vectoriel et de réordonnancement ont été conçus comme </w:t>
+      </w:r>
+      <w:r>
+        <w:rPr>
+          <w:rFonts w:ascii="Times New Roman" w:cs="Times New Roman" w:eastAsia="Times New Roman" w:hAnsi="Times New Roman"/>
+          <w:b/>
+          <w:bCs/>
+          <w:sz w:val="23"/>
+          <w:szCs w:val="23"/>
+        </w:rPr>
+        <w:t xml:space="preserve">enfichables</w:t>
+      </w:r>
+      <w:r>
+        <w:rPr>
+          <w:rFonts w:ascii="Times New Roman" w:cs="Times New Roman" w:eastAsia="Times New Roman" w:hAnsi="Times New Roman"/>
+          <w:sz w:val="23"/>
+          <w:szCs w:val="23"/>
+        </w:rPr>
+        <w:t xml:space="preserve"> : le système retient un encodeur neuronal local lorsqu’il est disponible et bascule automatiquement, sinon, sur un substitut hors-ligne, sans modification du code. Ce choix garantit que la chaîne fonctionne en toutes circonstances, au prix d’une composante sémantique réduite en l’absence d’encodeur neuronal, ainsi que l’analyse le précise au chapitre 4.</w:t>
+      </w:r>
+    </w:p>
+    <w:p>
+      <w:pPr>
+        <w:spacing w:after="140" w:line="320"/>
+        <w:ind w:firstLine="360"/>
+        <w:jc w:val="both"/>
+      </w:pPr>
+      <w:r>
+        <w:rPr>
+          <w:rFonts w:ascii="Times New Roman" w:cs="Times New Roman" w:eastAsia="Times New Roman" w:hAnsi="Times New Roman"/>
+          <w:sz w:val="23"/>
+          <w:szCs w:val="23"/>
+        </w:rPr>
+        <w:t xml:space="preserve">Une limite demeure et est assumée : sur une question hors du champ du corpus mais posée dans un corpus non vide, le système ne s’abstient pas encore systématiquement, faute d’un seuil de pertinence en deçà duquel aucune réponse ne serait produite. Son introduction constitue l’amélioration prioritaire de la restitution, identifiée au chapitre 4.</w:t>
       </w:r>
     </w:p>
     <w:p>

</xml_diff>